<commit_message>
Integrate Feeding America 2024 Alabama data and refresh reports
</commit_message>
<xml_diff>
--- a/deliverables/Data_for_Dinner_Project_Charter_and_Data_Plan.docx
+++ b/deliverables/Data_for_Dinner_Project_Charter_and_Data_Plan.docx
@@ -1353,6 +1353,127 @@
                 <w:color w:val="000000"/>
                 <w:sz w:val="18"/>
               </w:rPr>
+              <w:t>Alabama modeled outcome context</w:t>
+            </w:r>
+          </w:p>
+        </w:tc>
+        <w:tc>
+          <w:tcPr>
+            <w:tcW w:type="dxa" w:w="2340"/>
+            <w:tcMar>
+              <w:top w:w="80" w:type="dxa"/>
+              <w:start w:w="120" w:type="dxa"/>
+              <w:bottom w:w="80" w:type="dxa"/>
+              <w:end w:w="120" w:type="dxa"/>
+            </w:tcMar>
+            <w:vAlign w:val="center"/>
+          </w:tcPr>
+          <w:p>
+            <w:pPr>
+              <w:keepLines/>
+              <w:spacing w:before="0" w:after="0" w:line="252" w:lineRule="auto"/>
+              <w:jc w:val="left"/>
+            </w:pPr>
+            <w:r/>
+            <w:r>
+              <w:rPr>
+                <w:rFonts w:ascii="Calibri" w:hAnsi="Calibri"/>
+                <w:b w:val="0"/>
+                <w:color w:val="000000"/>
+                <w:sz w:val="18"/>
+              </w:rPr>
+              <w:t>Feeding America Map the Meal Gap 2026</w:t>
+            </w:r>
+          </w:p>
+        </w:tc>
+        <w:tc>
+          <w:tcPr>
+            <w:tcW w:type="dxa" w:w="1980"/>
+            <w:tcMar>
+              <w:top w:w="80" w:type="dxa"/>
+              <w:start w:w="120" w:type="dxa"/>
+              <w:bottom w:w="80" w:type="dxa"/>
+              <w:end w:w="120" w:type="dxa"/>
+            </w:tcMar>
+            <w:vAlign w:val="center"/>
+          </w:tcPr>
+          <w:p>
+            <w:pPr>
+              <w:keepLines/>
+              <w:spacing w:before="0" w:after="0" w:line="252" w:lineRule="auto"/>
+              <w:jc w:val="left"/>
+            </w:pPr>
+            <w:r/>
+            <w:r>
+              <w:rPr>
+                <w:rFonts w:ascii="Calibri" w:hAnsi="Calibri"/>
+                <w:b w:val="0"/>
+                <w:color w:val="000000"/>
+                <w:sz w:val="18"/>
+              </w:rPr>
+              <w:t>County and state; observation year 2024</w:t>
+            </w:r>
+          </w:p>
+        </w:tc>
+        <w:tc>
+          <w:tcPr>
+            <w:tcW w:type="dxa" w:w="3600"/>
+            <w:tcMar>
+              <w:top w:w="80" w:type="dxa"/>
+              <w:start w:w="120" w:type="dxa"/>
+              <w:bottom w:w="80" w:type="dxa"/>
+              <w:end w:w="120" w:type="dxa"/>
+            </w:tcMar>
+            <w:vAlign w:val="center"/>
+          </w:tcPr>
+          <w:p>
+            <w:pPr>
+              <w:keepLines/>
+              <w:spacing w:before="0" w:after="0" w:line="252" w:lineRule="auto"/>
+              <w:jc w:val="left"/>
+            </w:pPr>
+            <w:r/>
+            <w:r>
+              <w:rPr>
+                <w:rFonts w:ascii="Calibri" w:hAnsi="Calibri"/>
+                <w:b w:val="0"/>
+                <w:color w:val="000000"/>
+                <w:sz w:val="18"/>
+              </w:rPr>
+              <w:t>Report individual-level modeled food-insecurity and food-cost estimates as a separate layer.</w:t>
+            </w:r>
+          </w:p>
+        </w:tc>
+      </w:tr>
+      <w:tr>
+        <w:trPr>
+          <w:cantSplit/>
+        </w:trPr>
+        <w:tc>
+          <w:tcPr>
+            <w:tcW w:type="dxa" w:w="1440"/>
+            <w:tcMar>
+              <w:top w:w="80" w:type="dxa"/>
+              <w:start w:w="120" w:type="dxa"/>
+              <w:bottom w:w="80" w:type="dxa"/>
+              <w:end w:w="120" w:type="dxa"/>
+            </w:tcMar>
+            <w:vAlign w:val="center"/>
+          </w:tcPr>
+          <w:p>
+            <w:pPr>
+              <w:keepLines/>
+              <w:spacing w:before="0" w:after="0" w:line="252" w:lineRule="auto"/>
+              <w:jc w:val="left"/>
+            </w:pPr>
+            <w:r/>
+            <w:r>
+              <w:rPr>
+                <w:rFonts w:ascii="Calibri" w:hAnsi="Calibri"/>
+                <w:b w:val="0"/>
+                <w:color w:val="000000"/>
+                <w:sz w:val="18"/>
+              </w:rPr>
               <w:t>Optional county context</w:t>
             </w:r>
           </w:p>
@@ -1578,7 +1699,7 @@
           <w:color w:val="5B6573"/>
           <w:sz w:val="18"/>
         </w:rPr>
-        <w:t>Sources and access links are listed in Appendix B. Data vintages must be recorded at download time.</w:t>
+        <w:t>Sources and access links are listed in Appendix B. Data vintages must be recorded at download time. Request-only raw packages stay outside GitHub unless redistribution terms are explicit.</w:t>
       </w:r>
     </w:p>
     <w:p>
@@ -4449,6 +4570,25 @@
           <w:color w:val="000000"/>
           <w:sz w:val="22"/>
         </w:rPr>
+        <w:t>Retain the validated Feeding America 2024 county and state modeled estimates as a separate outcome layer.</w:t>
+      </w:r>
+    </w:p>
+    <w:p>
+      <w:pPr>
+        <w:keepLines/>
+        <w:numPr>
+          <w:ilvl w:val="0"/>
+          <w:numId w:val="10"/>
+        </w:numPr>
+        <w:spacing w:before="0" w:after="160" w:line="280" w:lineRule="auto"/>
+        <w:ind w:left="720" w:hanging="360"/>
+      </w:pPr>
+      <w:r>
+        <w:rPr>
+          <w:rFonts w:ascii="Calibri" w:hAnsi="Calibri"/>
+          <w:color w:val="000000"/>
+          <w:sz w:val="22"/>
+        </w:rPr>
         <w:t>Publish only finalized repository files and place roles in supporting material at the end.</w:t>
       </w:r>
     </w:p>
@@ -4594,7 +4734,7 @@
           <w:color w:val="000000"/>
           <w:sz w:val="22"/>
         </w:rPr>
-        <w:t>License and redistribution terms permit the planned use.</w:t>
+        <w:t>Access and redistribution terms are documented; raw package publication requires explicit permission.</w:t>
       </w:r>
     </w:p>
     <w:p>
@@ -5646,7 +5786,7 @@
                 <w:color w:val="000000"/>
                 <w:sz w:val="17"/>
               </w:rPr>
-              <w:t>Feeding America Alabama map data</w:t>
+              <w:t>Feeding America Map the Meal Gap 2026</w:t>
             </w:r>
           </w:p>
         </w:tc>
@@ -5675,7 +5815,7 @@
                 <w:color w:val="000000"/>
                 <w:sz w:val="17"/>
               </w:rPr>
-              <w:t>Potential Alabama context</w:t>
+              <w:t>Alabama county and state outcome context</w:t>
             </w:r>
           </w:p>
         </w:tc>
@@ -5704,7 +5844,7 @@
                 <w:color w:val="000000"/>
                 <w:sz w:val="17"/>
               </w:rPr>
-              <w:t>On hold</w:t>
+              <w:t>Accepted</w:t>
             </w:r>
           </w:p>
         </w:tc>
@@ -5733,7 +5873,7 @@
                 <w:color w:val="000000"/>
                 <w:sz w:val="17"/>
               </w:rPr>
-              <w:t>Add only after source file, year meaning, fields, denominator, geography, license, and Alabama totals are validated.</w:t>
+              <w:t>Use selected 2024 fields separately; keep the request-only raw archive outside GitHub and retain the reconciliation note.</w:t>
             </w:r>
           </w:p>
         </w:tc>
@@ -6088,6 +6228,102 @@
           <w:sz w:val="19"/>
         </w:rPr>
         <w:t xml:space="preserve"> Optional county- and state-level food-environment indicators with varying source years.</w:t>
+      </w:r>
+    </w:p>
+    <w:p>
+      <w:pPr>
+        <w:spacing w:after="120" w:line="264" w:lineRule="auto"/>
+        <w:ind w:left="403" w:hanging="403"/>
+      </w:pPr>
+      <w:r>
+        <w:rPr>
+          <w:rFonts w:ascii="Calibri" w:hAnsi="Calibri"/>
+          <w:color w:val="000000"/>
+          <w:sz w:val="19"/>
+        </w:rPr>
+        <w:t xml:space="preserve">7. Feeding America National Organization. </w:t>
+      </w:r>
+      <w:hyperlink r:id="rId17">
+        <w:r>
+          <w:rPr>
+            <w:color w:val="2E74B5"/>
+            <w:u w:val="single"/>
+            <w:rFonts w:ascii="Calibri" w:hAnsi="Calibri"/>
+          </w:rPr>
+          <w:t>Map the Meal Gap 2026 Report</w:t>
+        </w:r>
+      </w:hyperlink>
+      <w:r>
+        <w:rPr>
+          <w:rFonts w:ascii="Calibri" w:hAnsi="Calibri"/>
+          <w:color w:val="5B6573"/>
+          <w:sz w:val="19"/>
+        </w:rPr>
+        <w:t xml:space="preserve"> Published July 28, 2026; modeled local food-insecurity and food-cost estimates for observation year 2024.</w:t>
+      </w:r>
+    </w:p>
+    <w:p>
+      <w:pPr>
+        <w:spacing w:after="120" w:line="264" w:lineRule="auto"/>
+        <w:ind w:left="403" w:hanging="403"/>
+      </w:pPr>
+      <w:r>
+        <w:rPr>
+          <w:rFonts w:ascii="Calibri" w:hAnsi="Calibri"/>
+          <w:color w:val="000000"/>
+          <w:sz w:val="19"/>
+        </w:rPr>
+        <w:t xml:space="preserve">8. Feeding America National Organization. </w:t>
+      </w:r>
+      <w:hyperlink r:id="rId18">
+        <w:r>
+          <w:rPr>
+            <w:color w:val="2E74B5"/>
+            <w:u w:val="single"/>
+            <w:rFonts w:ascii="Calibri" w:hAnsi="Calibri"/>
+          </w:rPr>
+          <w:t>Map the Meal Gap Methodology</w:t>
+        </w:r>
+      </w:hyperlink>
+      <w:r>
+        <w:rPr>
+          <w:rFonts w:ascii="Calibri" w:hAnsi="Calibri"/>
+          <w:color w:val="5B6573"/>
+          <w:sz w:val="19"/>
+        </w:rPr>
+        <w:t xml:space="preserve"> Methods, geographic models, food budget shortfall, and meal-cost definitions.</w:t>
+      </w:r>
+    </w:p>
+    <w:p>
+      <w:pPr>
+        <w:spacing w:after="120" w:line="264" w:lineRule="auto"/>
+        <w:ind w:left="403" w:hanging="403"/>
+      </w:pPr>
+      <w:r>
+        <w:rPr>
+          <w:rFonts w:ascii="Calibri" w:hAnsi="Calibri"/>
+          <w:color w:val="000000"/>
+          <w:sz w:val="19"/>
+        </w:rPr>
+        <w:t xml:space="preserve">9. Feeding America National Organization. </w:t>
+      </w:r>
+      <w:hyperlink r:id="rId19">
+        <w:r>
+          <w:rPr>
+            <w:color w:val="2E74B5"/>
+            <w:u w:val="single"/>
+            <w:rFonts w:ascii="Calibri" w:hAnsi="Calibri"/>
+          </w:rPr>
+          <w:t>Map the Meal Gap Data Request</w:t>
+        </w:r>
+      </w:hyperlink>
+      <w:r>
+        <w:rPr>
+          <w:rFonts w:ascii="Calibri" w:hAnsi="Calibri"/>
+          <w:color w:val="5B6573"/>
+          <w:sz w:val="19"/>
+        </w:rPr>
+        <w:t xml:space="preserve"> Official request workflow for the source package. The raw archive remains outside GitHub because it contains no explicit redistribution license.</w:t>
       </w:r>
     </w:p>
     <w:p>

</xml_diff>

<commit_message>
Credit Sandra Kopecky and integrate prevailing story workbook
</commit_message>
<xml_diff>
--- a/deliverables/Data_for_Dinner_Project_Charter_and_Data_Plan.docx
+++ b/deliverables/Data_for_Dinner_Project_Charter_and_Data_Plan.docx
@@ -62,7 +62,7 @@
           <w:color w:val="000000"/>
           <w:sz w:val="22"/>
         </w:rPr>
-        <w:t>Updated with decisions from August 25, 2026</w:t>
+        <w:t>Updated through August 29, 2026, including Sandra Kopecky's prevailing team story workbook</w:t>
       </w:r>
     </w:p>
     <w:p>
@@ -1441,6 +1441,127 @@
                 <w:sz w:val="18"/>
               </w:rPr>
               <w:t>Report individual-level modeled food-insecurity and food-cost estimates as a separate layer.</w:t>
+            </w:r>
+          </w:p>
+        </w:tc>
+      </w:tr>
+      <w:tr>
+        <w:trPr>
+          <w:cantSplit/>
+        </w:trPr>
+        <w:tc>
+          <w:tcPr>
+            <w:tcW w:type="dxa" w:w="1440"/>
+            <w:tcMar>
+              <w:top w:w="80" w:type="dxa"/>
+              <w:start w:w="120" w:type="dxa"/>
+              <w:bottom w:w="80" w:type="dxa"/>
+              <w:end w:w="120" w:type="dxa"/>
+            </w:tcMar>
+            <w:vAlign w:val="center"/>
+          </w:tcPr>
+          <w:p>
+            <w:pPr>
+              <w:keepLines/>
+              <w:spacing w:before="0" w:after="0" w:line="252" w:lineRule="auto"/>
+              <w:jc w:val="left"/>
+            </w:pPr>
+            <w:r/>
+            <w:r>
+              <w:rPr>
+                <w:rFonts w:ascii="Calibri" w:hAnsi="Calibri"/>
+                <w:b w:val="0"/>
+                <w:color w:val="000000"/>
+                <w:sz w:val="18"/>
+              </w:rPr>
+              <w:t>Team story synthesis</w:t>
+            </w:r>
+          </w:p>
+        </w:tc>
+        <w:tc>
+          <w:tcPr>
+            <w:tcW w:type="dxa" w:w="2340"/>
+            <w:tcMar>
+              <w:top w:w="80" w:type="dxa"/>
+              <w:start w:w="120" w:type="dxa"/>
+              <w:bottom w:w="80" w:type="dxa"/>
+              <w:end w:w="120" w:type="dxa"/>
+            </w:tcMar>
+            <w:vAlign w:val="center"/>
+          </w:tcPr>
+          <w:p>
+            <w:pPr>
+              <w:keepLines/>
+              <w:spacing w:before="0" w:after="0" w:line="252" w:lineRule="auto"/>
+              <w:jc w:val="left"/>
+            </w:pPr>
+            <w:r/>
+            <w:r>
+              <w:rPr>
+                <w:rFonts w:ascii="Calibri" w:hAnsi="Calibri"/>
+                <w:b w:val="0"/>
+                <w:color w:val="000000"/>
+                <w:sz w:val="18"/>
+              </w:rPr>
+              <w:t>Sandra Kopecky, WomenInData Data Stats and Summary - Story</w:t>
+            </w:r>
+          </w:p>
+        </w:tc>
+        <w:tc>
+          <w:tcPr>
+            <w:tcW w:type="dxa" w:w="1980"/>
+            <w:tcMar>
+              <w:top w:w="80" w:type="dxa"/>
+              <w:start w:w="120" w:type="dxa"/>
+              <w:bottom w:w="80" w:type="dxa"/>
+              <w:end w:w="120" w:type="dxa"/>
+            </w:tcMar>
+            <w:vAlign w:val="center"/>
+          </w:tcPr>
+          <w:p>
+            <w:pPr>
+              <w:keepLines/>
+              <w:spacing w:before="0" w:after="0" w:line="252" w:lineRule="auto"/>
+              <w:jc w:val="left"/>
+            </w:pPr>
+            <w:r/>
+            <w:r>
+              <w:rPr>
+                <w:rFonts w:ascii="Calibri" w:hAnsi="Calibri"/>
+                <w:b w:val="0"/>
+                <w:color w:val="000000"/>
+                <w:sz w:val="18"/>
+              </w:rPr>
+              <w:t>Global to Alabama narrative</w:t>
+            </w:r>
+          </w:p>
+        </w:tc>
+        <w:tc>
+          <w:tcPr>
+            <w:tcW w:type="dxa" w:w="3600"/>
+            <w:tcMar>
+              <w:top w:w="80" w:type="dxa"/>
+              <w:start w:w="120" w:type="dxa"/>
+              <w:bottom w:w="80" w:type="dxa"/>
+              <w:end w:w="120" w:type="dxa"/>
+            </w:tcMar>
+            <w:vAlign w:val="center"/>
+          </w:tcPr>
+          <w:p>
+            <w:pPr>
+              <w:keepLines/>
+              <w:spacing w:before="0" w:after="0" w:line="252" w:lineRule="auto"/>
+              <w:jc w:val="left"/>
+            </w:pPr>
+            <w:r/>
+            <w:r>
+              <w:rPr>
+                <w:rFonts w:ascii="Calibri" w:hAnsi="Calibri"/>
+                <w:b w:val="0"/>
+                <w:color w:val="000000"/>
+                <w:sz w:val="18"/>
+              </w:rPr>
+              <w:t>Use as the prevailing presentation-development workbook; credit Sandra and validate exact claims against the reproducible tables.</w:t>
             </w:r>
           </w:p>
         </w:tc>
@@ -5907,6 +6028,156 @@
                 <w:color w:val="000000"/>
                 <w:sz w:val="17"/>
               </w:rPr>
+              <w:t>D07</w:t>
+            </w:r>
+          </w:p>
+        </w:tc>
+        <w:tc>
+          <w:tcPr>
+            <w:tcW w:type="dxa" w:w="2460"/>
+            <w:tcMar>
+              <w:top w:w="80" w:type="dxa"/>
+              <w:start w:w="120" w:type="dxa"/>
+              <w:bottom w:w="80" w:type="dxa"/>
+              <w:end w:w="120" w:type="dxa"/>
+            </w:tcMar>
+            <w:vAlign w:val="center"/>
+          </w:tcPr>
+          <w:p>
+            <w:pPr>
+              <w:keepLines/>
+              <w:spacing w:before="0" w:after="0" w:line="252" w:lineRule="auto"/>
+              <w:jc w:val="left"/>
+            </w:pPr>
+            <w:r/>
+            <w:r>
+              <w:rPr>
+                <w:rFonts w:ascii="Calibri" w:hAnsi="Calibri"/>
+                <w:b w:val="0"/>
+                <w:color w:val="000000"/>
+                <w:sz w:val="17"/>
+              </w:rPr>
+              <w:t>Sandra Kopecky story workbook</w:t>
+            </w:r>
+          </w:p>
+        </w:tc>
+        <w:tc>
+          <w:tcPr>
+            <w:tcW w:type="dxa" w:w="1740"/>
+            <w:tcMar>
+              <w:top w:w="80" w:type="dxa"/>
+              <w:start w:w="120" w:type="dxa"/>
+              <w:bottom w:w="80" w:type="dxa"/>
+              <w:end w:w="120" w:type="dxa"/>
+            </w:tcMar>
+            <w:vAlign w:val="center"/>
+          </w:tcPr>
+          <w:p>
+            <w:pPr>
+              <w:keepLines/>
+              <w:spacing w:before="0" w:after="0" w:line="252" w:lineRule="auto"/>
+              <w:jc w:val="left"/>
+            </w:pPr>
+            <w:r/>
+            <w:r>
+              <w:rPr>
+                <w:rFonts w:ascii="Calibri" w:hAnsi="Calibri"/>
+                <w:b w:val="0"/>
+                <w:color w:val="000000"/>
+                <w:sz w:val="17"/>
+              </w:rPr>
+              <w:t>Prevailing team narrative synthesis</w:t>
+            </w:r>
+          </w:p>
+        </w:tc>
+        <w:tc>
+          <w:tcPr>
+            <w:tcW w:type="dxa" w:w="1260"/>
+            <w:tcMar>
+              <w:top w:w="80" w:type="dxa"/>
+              <w:start w:w="120" w:type="dxa"/>
+              <w:bottom w:w="80" w:type="dxa"/>
+              <w:end w:w="120" w:type="dxa"/>
+            </w:tcMar>
+            <w:vAlign w:val="center"/>
+          </w:tcPr>
+          <w:p>
+            <w:pPr>
+              <w:keepLines/>
+              <w:spacing w:before="0" w:after="0" w:line="252" w:lineRule="auto"/>
+              <w:jc w:val="left"/>
+            </w:pPr>
+            <w:r/>
+            <w:r>
+              <w:rPr>
+                <w:rFonts w:ascii="Calibri" w:hAnsi="Calibri"/>
+                <w:b w:val="0"/>
+                <w:color w:val="000000"/>
+                <w:sz w:val="17"/>
+              </w:rPr>
+              <w:t>Accepted</w:t>
+            </w:r>
+          </w:p>
+        </w:tc>
+        <w:tc>
+          <w:tcPr>
+            <w:tcW w:type="dxa" w:w="3180"/>
+            <w:tcMar>
+              <w:top w:w="80" w:type="dxa"/>
+              <w:start w:w="120" w:type="dxa"/>
+              <w:bottom w:w="80" w:type="dxa"/>
+              <w:end w:w="120" w:type="dxa"/>
+            </w:tcMar>
+            <w:vAlign w:val="center"/>
+          </w:tcPr>
+          <w:p>
+            <w:pPr>
+              <w:keepLines/>
+              <w:spacing w:before="0" w:after="0" w:line="252" w:lineRule="auto"/>
+              <w:jc w:val="left"/>
+            </w:pPr>
+            <w:r/>
+            <w:r>
+              <w:rPr>
+                <w:rFonts w:ascii="Calibri" w:hAnsi="Calibri"/>
+                <w:b w:val="0"/>
+                <w:color w:val="000000"/>
+                <w:sz w:val="17"/>
+              </w:rPr>
+              <w:t>Preserve the submitted workbook unchanged, credit Sandra, and validate exact claims against repository tables.</w:t>
+            </w:r>
+          </w:p>
+        </w:tc>
+      </w:tr>
+      <w:tr>
+        <w:trPr>
+          <w:cantSplit/>
+        </w:trPr>
+        <w:tc>
+          <w:tcPr>
+            <w:tcW w:type="dxa" w:w="720"/>
+            <w:tcMar>
+              <w:top w:w="80" w:type="dxa"/>
+              <w:start w:w="120" w:type="dxa"/>
+              <w:bottom w:w="80" w:type="dxa"/>
+              <w:end w:w="120" w:type="dxa"/>
+            </w:tcMar>
+            <w:vAlign w:val="center"/>
+          </w:tcPr>
+          <w:p>
+            <w:pPr>
+              <w:keepLines/>
+              <w:spacing w:before="0" w:after="0" w:line="252" w:lineRule="auto"/>
+              <w:jc w:val="left"/>
+            </w:pPr>
+            <w:r/>
+            <w:r>
+              <w:rPr>
+                <w:rFonts w:ascii="Calibri" w:hAnsi="Calibri"/>
+                <w:b w:val="0"/>
+                <w:color w:val="000000"/>
+                <w:sz w:val="17"/>
+              </w:rPr>
               <w:t>A01</w:t>
             </w:r>
           </w:p>
@@ -6726,7 +6997,7 @@
                 <w:color w:val="000000"/>
                 <w:sz w:val="18"/>
               </w:rPr>
-              <w:t>Data and database</w:t>
+              <w:t>Data, database, and story synthesis</w:t>
             </w:r>
           </w:p>
         </w:tc>
@@ -6755,7 +7026,7 @@
                 <w:color w:val="000000"/>
                 <w:sz w:val="18"/>
               </w:rPr>
-              <w:t>Review sources and use the approved dataset for analysis.</w:t>
+              <w:t>Pull and organize data; author the prevailing team story workbook; develop regional framing and Alabama narrative content.</w:t>
             </w:r>
           </w:p>
         </w:tc>

</xml_diff>